<commit_message>
Match the assignment exactly: add deployment positions and sensor on/off schedule, remove extras
- chromosome now has a deployment position per drone and a sensor on/off
  bit per leg (hybrid real + binary encoding), as the assignment asks
- remove items the assignment does not ask for: tests, --quick mode,
  learning guide, notebook, report generator script, extra final map
- re-run all experiments and update README and report
</commit_message>
<xml_diff>
--- a/report/Technical_Report.docx
+++ b/report/Technical_Report.docx
@@ -155,7 +155,7 @@
         <w:jc w:val="both"/>
       </w:pPr>
       <w:r>
-        <w:t>A company uses drones (UAVs) to survey a disaster area. We must decide where each drone flies, how fast it flies and how strong its sensor is. A good plan covers the important areas and finds the targets, but it should also save battery, finish quickly and stay away from dangerous zones. These goals conflict, so there is no single correct answer. I solved this problem with a Genetic Algorithm (GA) written from scratch in Python.</w:t>
+        <w:t>A company uses drones (UAVs) to survey a disaster area. We must decide where each drone is deployed, where it flies, how fast it flies and when (and how strongly) its sensor is switched on. A good plan covers the important areas and finds the targets, but it should also save battery, finish quickly and stay away from dangerous zones. These goals conflict, so there is no single correct answer. I solved this problem with a Genetic Algorithm (GA) written from scratch in Python.</w:t>
       </w:r>
     </w:p>
     <w:p>
@@ -163,7 +163,7 @@
         <w:jc w:val="both"/>
       </w:pPr>
       <w:r>
-        <w:t>The area is a 50 x 50 grid. It has 3 no-fly zones (blocked cells), 3 hazard zones (high wind / radiation), 3 priority (disaster) zones and 15 targets. 3 drones start at the base (2.0, 2.0), visit 6 waypoints each and return to the base. Each drone may fly at most 200 cells. One hazard zone lies on top of the most important disaster zone, so the GA must find a balance between coverage and safety.</w:t>
+        <w:t>The area is a 50 x 50 grid. It has 3 no-fly zones (blocked cells), 3 hazard zones (high wind / radiation), 3 priority (disaster) zones and 15 targets. 3 drones are launched from their deployment positions, visit 6 waypoints each and return to their deployment position. Each drone may fly at most 150 cells. One hazard zone lies on top of the most important disaster zone, so the GA must find a balance between coverage and safety.</w:t>
       </w:r>
     </w:p>
     <w:p>
@@ -179,11 +179,12 @@
         <w:jc w:val="both"/>
       </w:pPr>
       <w:r>
-        <w:t>Each chromosome is one complete plan for the whole fleet. It is a real-valued array with one segment per drone. Every waypoint has four genes:</w:t>
+        <w:t>Each chromosome is one complete plan for the whole fleet. It is a hybrid (real + binary) multi-segment encoding with one segment per drone: [deploy_x, deploy_y | (x, y, speed, power, on) x 6 waypoints].</w:t>
       </w:r>
     </w:p>
     <w:p>
       <w:pPr>
+        <w:keepNext/>
         <w:jc w:val="center"/>
       </w:pPr>
       <w:r>
@@ -191,7 +192,7 @@
           <w:b/>
           <w:sz w:val="18"/>
         </w:rPr>
-        <w:t>Table 1: Genes of one waypoint (chromosome size = 3 drones x 6 waypoints x 4 genes = 72 genes)</w:t>
+        <w:t>Table 1: Genes of one drone segment (3 drones x (2 + 6 x 5) = 96 genes)</w:t>
       </w:r>
     </w:p>
     <w:tbl>
@@ -201,16 +202,23 @@
         <w:tblLook w:firstColumn="1" w:firstRow="1" w:lastColumn="0" w:lastRow="0" w:noHBand="0" w:noVBand="1" w:val="04A0"/>
       </w:tblPr>
       <w:tblGrid>
-        <w:gridCol w:w="3324"/>
-        <w:gridCol w:w="3324"/>
-        <w:gridCol w:w="3324"/>
+        <w:gridCol w:w="1984"/>
+        <w:gridCol w:w="907"/>
+        <w:gridCol w:w="4819"/>
+        <w:gridCol w:w="1928"/>
       </w:tblGrid>
       <w:tr>
+        <w:trPr>
+          <w:cantSplit/>
+        </w:trPr>
         <w:tc>
           <w:tcPr>
-            <w:tcW w:type="dxa" w:w="3324"/>
+            <w:tcW w:type="dxa" w:w="1984"/>
           </w:tcPr>
           <w:p>
+            <w:pPr>
+              <w:keepNext/>
+            </w:pPr>
             <w:r>
               <w:rPr>
                 <w:b/>
@@ -222,9 +230,29 @@
         </w:tc>
         <w:tc>
           <w:tcPr>
-            <w:tcW w:type="dxa" w:w="3324"/>
+            <w:tcW w:type="dxa" w:w="907"/>
           </w:tcPr>
           <w:p>
+            <w:pPr>
+              <w:keepNext/>
+            </w:pPr>
+            <w:r>
+              <w:rPr>
+                <w:b/>
+                <w:sz w:val="18"/>
+              </w:rPr>
+              <w:t>Type</w:t>
+            </w:r>
+          </w:p>
+        </w:tc>
+        <w:tc>
+          <w:tcPr>
+            <w:tcW w:type="dxa" w:w="4819"/>
+          </w:tcPr>
+          <w:p>
+            <w:pPr>
+              <w:keepNext/>
+            </w:pPr>
             <w:r>
               <w:rPr>
                 <w:b/>
@@ -236,9 +264,12 @@
         </w:tc>
         <w:tc>
           <w:tcPr>
-            <w:tcW w:type="dxa" w:w="3324"/>
+            <w:tcW w:type="dxa" w:w="1928"/>
           </w:tcPr>
           <w:p>
+            <w:pPr>
+              <w:keepNext/>
+            </w:pPr>
             <w:r>
               <w:rPr>
                 <w:b/>
@@ -250,11 +281,90 @@
         </w:tc>
       </w:tr>
       <w:tr>
+        <w:trPr>
+          <w:cantSplit/>
+        </w:trPr>
         <w:tc>
           <w:tcPr>
-            <w:tcW w:type="dxa" w:w="3324"/>
+            <w:tcW w:type="dxa" w:w="1984"/>
           </w:tcPr>
           <w:p>
+            <w:pPr>
+              <w:keepNext/>
+            </w:pPr>
+            <w:r>
+              <w:rPr>
+                <w:b w:val="0"/>
+                <w:sz w:val="18"/>
+              </w:rPr>
+              <w:t>deploy_x, deploy_y</w:t>
+            </w:r>
+          </w:p>
+        </w:tc>
+        <w:tc>
+          <w:tcPr>
+            <w:tcW w:type="dxa" w:w="907"/>
+          </w:tcPr>
+          <w:p>
+            <w:pPr>
+              <w:keepNext/>
+            </w:pPr>
+            <w:r>
+              <w:rPr>
+                <w:b w:val="0"/>
+                <w:sz w:val="18"/>
+              </w:rPr>
+              <w:t>real</w:t>
+            </w:r>
+          </w:p>
+        </w:tc>
+        <w:tc>
+          <w:tcPr>
+            <w:tcW w:type="dxa" w:w="4819"/>
+          </w:tcPr>
+          <w:p>
+            <w:pPr>
+              <w:keepNext/>
+            </w:pPr>
+            <w:r>
+              <w:rPr>
+                <w:b w:val="0"/>
+                <w:sz w:val="18"/>
+              </w:rPr>
+              <w:t>deployment position (launch and landing point)</w:t>
+            </w:r>
+          </w:p>
+        </w:tc>
+        <w:tc>
+          <w:tcPr>
+            <w:tcW w:type="dxa" w:w="1928"/>
+          </w:tcPr>
+          <w:p>
+            <w:pPr>
+              <w:keepNext/>
+            </w:pPr>
+            <w:r>
+              <w:rPr>
+                <w:b w:val="0"/>
+                <w:sz w:val="18"/>
+              </w:rPr>
+              <w:t>0 – 50</w:t>
+            </w:r>
+          </w:p>
+        </w:tc>
+      </w:tr>
+      <w:tr>
+        <w:trPr>
+          <w:cantSplit/>
+        </w:trPr>
+        <w:tc>
+          <w:tcPr>
+            <w:tcW w:type="dxa" w:w="1984"/>
+          </w:tcPr>
+          <w:p>
+            <w:pPr>
+              <w:keepNext/>
+            </w:pPr>
             <w:r>
               <w:rPr>
                 <w:b w:val="0"/>
@@ -266,23 +376,46 @@
         </w:tc>
         <w:tc>
           <w:tcPr>
-            <w:tcW w:type="dxa" w:w="3324"/>
+            <w:tcW w:type="dxa" w:w="907"/>
           </w:tcPr>
           <w:p>
+            <w:pPr>
+              <w:keepNext/>
+            </w:pPr>
             <w:r>
               <w:rPr>
                 <w:b w:val="0"/>
                 <w:sz w:val="18"/>
               </w:rPr>
-              <w:t>position of the waypoint</w:t>
+              <w:t>real</w:t>
             </w:r>
           </w:p>
         </w:tc>
         <w:tc>
           <w:tcPr>
-            <w:tcW w:type="dxa" w:w="3324"/>
+            <w:tcW w:type="dxa" w:w="4819"/>
           </w:tcPr>
           <w:p>
+            <w:pPr>
+              <w:keepNext/>
+            </w:pPr>
+            <w:r>
+              <w:rPr>
+                <w:b w:val="0"/>
+                <w:sz w:val="18"/>
+              </w:rPr>
+              <w:t>position of a waypoint</w:t>
+            </w:r>
+          </w:p>
+        </w:tc>
+        <w:tc>
+          <w:tcPr>
+            <w:tcW w:type="dxa" w:w="1928"/>
+          </w:tcPr>
+          <w:p>
+            <w:pPr>
+              <w:keepNext/>
+            </w:pPr>
             <w:r>
               <w:rPr>
                 <w:b w:val="0"/>
@@ -294,11 +427,17 @@
         </w:tc>
       </w:tr>
       <w:tr>
+        <w:trPr>
+          <w:cantSplit/>
+        </w:trPr>
         <w:tc>
           <w:tcPr>
-            <w:tcW w:type="dxa" w:w="3324"/>
+            <w:tcW w:type="dxa" w:w="1984"/>
           </w:tcPr>
           <w:p>
+            <w:pPr>
+              <w:keepNext/>
+            </w:pPr>
             <w:r>
               <w:rPr>
                 <w:b w:val="0"/>
@@ -310,9 +449,29 @@
         </w:tc>
         <w:tc>
           <w:tcPr>
-            <w:tcW w:type="dxa" w:w="3324"/>
+            <w:tcW w:type="dxa" w:w="907"/>
           </w:tcPr>
           <w:p>
+            <w:pPr>
+              <w:keepNext/>
+            </w:pPr>
+            <w:r>
+              <w:rPr>
+                <w:b w:val="0"/>
+                <w:sz w:val="18"/>
+              </w:rPr>
+              <w:t>real</w:t>
+            </w:r>
+          </w:p>
+        </w:tc>
+        <w:tc>
+          <w:tcPr>
+            <w:tcW w:type="dxa" w:w="4819"/>
+          </w:tcPr>
+          <w:p>
+            <w:pPr>
+              <w:keepNext/>
+            </w:pPr>
             <w:r>
               <w:rPr>
                 <w:b w:val="0"/>
@@ -324,9 +483,12 @@
         </w:tc>
         <w:tc>
           <w:tcPr>
-            <w:tcW w:type="dxa" w:w="3324"/>
+            <w:tcW w:type="dxa" w:w="1928"/>
           </w:tcPr>
           <w:p>
+            <w:pPr>
+              <w:keepNext/>
+            </w:pPr>
             <w:r>
               <w:rPr>
                 <w:b w:val="0"/>
@@ -338,45 +500,147 @@
         </w:tc>
       </w:tr>
       <w:tr>
+        <w:trPr>
+          <w:cantSplit/>
+        </w:trPr>
         <w:tc>
           <w:tcPr>
-            <w:tcW w:type="dxa" w:w="3324"/>
+            <w:tcW w:type="dxa" w:w="1984"/>
           </w:tcPr>
           <w:p>
+            <w:pPr>
+              <w:keepNext/>
+            </w:pPr>
             <w:r>
               <w:rPr>
                 <w:b w:val="0"/>
                 <w:sz w:val="18"/>
               </w:rPr>
-              <w:t>sensor power</w:t>
+              <w:t>power</w:t>
             </w:r>
           </w:p>
         </w:tc>
         <w:tc>
           <w:tcPr>
-            <w:tcW w:type="dxa" w:w="3324"/>
+            <w:tcW w:type="dxa" w:w="907"/>
           </w:tcPr>
           <w:p>
+            <w:pPr>
+              <w:keepNext/>
+            </w:pPr>
             <w:r>
               <w:rPr>
                 <w:b w:val="0"/>
                 <w:sz w:val="18"/>
               </w:rPr>
-              <w:t>sensor strength (radius 1 to 4 cells)</w:t>
+              <w:t>real</w:t>
             </w:r>
           </w:p>
         </w:tc>
         <w:tc>
           <w:tcPr>
-            <w:tcW w:type="dxa" w:w="3324"/>
+            <w:tcW w:type="dxa" w:w="4819"/>
           </w:tcPr>
           <w:p>
+            <w:pPr>
+              <w:keepNext/>
+            </w:pPr>
+            <w:r>
+              <w:rPr>
+                <w:b w:val="0"/>
+                <w:sz w:val="18"/>
+              </w:rPr>
+              <w:t>sensor power (radius 1 to 4 cells)</w:t>
+            </w:r>
+          </w:p>
+        </w:tc>
+        <w:tc>
+          <w:tcPr>
+            <w:tcW w:type="dxa" w:w="1928"/>
+          </w:tcPr>
+          <w:p>
+            <w:pPr>
+              <w:keepNext/>
+            </w:pPr>
             <w:r>
               <w:rPr>
                 <w:b w:val="0"/>
                 <w:sz w:val="18"/>
               </w:rPr>
               <w:t>0 – 1</w:t>
+            </w:r>
+          </w:p>
+        </w:tc>
+      </w:tr>
+      <w:tr>
+        <w:trPr>
+          <w:cantSplit/>
+        </w:trPr>
+        <w:tc>
+          <w:tcPr>
+            <w:tcW w:type="dxa" w:w="1984"/>
+          </w:tcPr>
+          <w:p>
+            <w:pPr>
+              <w:keepNext w:val="0"/>
+            </w:pPr>
+            <w:r>
+              <w:rPr>
+                <w:b w:val="0"/>
+                <w:sz w:val="18"/>
+              </w:rPr>
+              <w:t>on</w:t>
+            </w:r>
+          </w:p>
+        </w:tc>
+        <w:tc>
+          <w:tcPr>
+            <w:tcW w:type="dxa" w:w="907"/>
+          </w:tcPr>
+          <w:p>
+            <w:pPr>
+              <w:keepNext w:val="0"/>
+            </w:pPr>
+            <w:r>
+              <w:rPr>
+                <w:b w:val="0"/>
+                <w:sz w:val="18"/>
+              </w:rPr>
+              <w:t>binary</w:t>
+            </w:r>
+          </w:p>
+        </w:tc>
+        <w:tc>
+          <w:tcPr>
+            <w:tcW w:type="dxa" w:w="4819"/>
+          </w:tcPr>
+          <w:p>
+            <w:pPr>
+              <w:keepNext w:val="0"/>
+            </w:pPr>
+            <w:r>
+              <w:rPr>
+                <w:b w:val="0"/>
+                <w:sz w:val="18"/>
+              </w:rPr>
+              <w:t>sensor on/off on this leg (activation schedule)</w:t>
+            </w:r>
+          </w:p>
+        </w:tc>
+        <w:tc>
+          <w:tcPr>
+            <w:tcW w:type="dxa" w:w="1928"/>
+          </w:tcPr>
+          <w:p>
+            <w:pPr>
+              <w:keepNext w:val="0"/>
+            </w:pPr>
+            <w:r>
+              <w:rPr>
+                <w:b w:val="0"/>
+                <w:sz w:val="18"/>
+              </w:rPr>
+              <w:t>0 or 1</w:t>
             </w:r>
           </w:p>
         </w:tc>
@@ -388,7 +652,7 @@
         <w:jc w:val="both"/>
       </w:pPr>
       <w:r>
-        <w:t>Why this design? (1) It is simple: the genes are exactly the things we must decide (waypoints, speed and sensor power). (2) Real numbers suit positions on a map: a small change in a gene gives a small change in the route, which works well with Gaussian mutation and blend crossover. (3) One segment per drone means a good route of one drone can be passed to a child as a whole block. (4) The sensor power gene lets the GA switch the sensor to low power where there is nothing to see and save energy.</w:t>
+        <w:t>Why this design? (1) It is simple: the genes are exactly the things the assignment asks us to decide (deployment positions, waypoints, speed, sensor power and sensor activation schedule). (2) Real numbers suit positions on a map: a small change in a gene gives a small change in the route, which works well with Gaussian mutation and blend crossover. (3) One segment per drone means a good route of one drone can be passed to a child as a whole block. (4) The on/off bit lets the GA switch the sensor off while travelling and save energy, and the power gene lets it choose a big or small sensor circle where it is on.</w:t>
       </w:r>
     </w:p>
     <w:p>
@@ -409,293 +673,49 @@
     </w:p>
     <w:p>
       <w:pPr>
-        <w:jc w:val="center"/>
+        <w:pStyle w:val="ListBullet"/>
+        <w:spacing w:after="20"/>
       </w:pPr>
       <w:r>
-        <w:rPr>
-          <w:b/>
-          <w:sz w:val="18"/>
-        </w:rPr>
-        <w:t>Table 2: Objectives and weights</w:t>
+        <w:t>Coverage (maximise, weight 0.35): priority-weighted share of cells inside a sensor circle.</w:t>
       </w:r>
     </w:p>
-    <w:tbl>
-      <w:tblPr>
-        <w:tblStyle w:val="LightGrid-Accent1"/>
-        <w:tblW w:type="auto" w:w="0"/>
-        <w:tblLook w:firstColumn="1" w:firstRow="1" w:lastColumn="0" w:lastRow="0" w:noHBand="0" w:noVBand="1" w:val="04A0"/>
-      </w:tblPr>
-      <w:tblGrid>
-        <w:gridCol w:w="3324"/>
-        <w:gridCol w:w="3324"/>
-        <w:gridCol w:w="3324"/>
-      </w:tblGrid>
-      <w:tr>
-        <w:tc>
-          <w:tcPr>
-            <w:tcW w:type="dxa" w:w="3324"/>
-          </w:tcPr>
-          <w:p>
-            <w:r>
-              <w:rPr>
-                <w:b/>
-                <w:sz w:val="18"/>
-              </w:rPr>
-              <w:t>Objective</w:t>
-            </w:r>
-          </w:p>
-        </w:tc>
-        <w:tc>
-          <w:tcPr>
-            <w:tcW w:type="dxa" w:w="3324"/>
-          </w:tcPr>
-          <w:p>
-            <w:r>
-              <w:rPr>
-                <w:b/>
-                <w:sz w:val="18"/>
-              </w:rPr>
-              <w:t>How it is measured (scaled to 0–1)</w:t>
-            </w:r>
-          </w:p>
-        </w:tc>
-        <w:tc>
-          <w:tcPr>
-            <w:tcW w:type="dxa" w:w="3324"/>
-          </w:tcPr>
-          <w:p>
-            <w:r>
-              <w:rPr>
-                <w:b/>
-                <w:sz w:val="18"/>
-              </w:rPr>
-              <w:t>Weight</w:t>
-            </w:r>
-          </w:p>
-        </w:tc>
-      </w:tr>
-      <w:tr>
-        <w:tc>
-          <w:tcPr>
-            <w:tcW w:type="dxa" w:w="3324"/>
-          </w:tcPr>
-          <w:p>
-            <w:r>
-              <w:rPr>
-                <w:b w:val="0"/>
-                <w:sz w:val="18"/>
-              </w:rPr>
-              <w:t>Coverage (max)</w:t>
-            </w:r>
-          </w:p>
-        </w:tc>
-        <w:tc>
-          <w:tcPr>
-            <w:tcW w:type="dxa" w:w="3324"/>
-          </w:tcPr>
-          <w:p>
-            <w:r>
-              <w:rPr>
-                <w:b w:val="0"/>
-                <w:sz w:val="18"/>
-              </w:rPr>
-              <w:t>priority-weighted share of cells inside a sensor circle</w:t>
-            </w:r>
-          </w:p>
-        </w:tc>
-        <w:tc>
-          <w:tcPr>
-            <w:tcW w:type="dxa" w:w="3324"/>
-          </w:tcPr>
-          <w:p>
-            <w:r>
-              <w:rPr>
-                <w:b w:val="0"/>
-                <w:sz w:val="18"/>
-              </w:rPr>
-              <w:t>0.35</w:t>
-            </w:r>
-          </w:p>
-        </w:tc>
-      </w:tr>
-      <w:tr>
-        <w:tc>
-          <w:tcPr>
-            <w:tcW w:type="dxa" w:w="3324"/>
-          </w:tcPr>
-          <w:p>
-            <w:r>
-              <w:rPr>
-                <w:b w:val="0"/>
-                <w:sz w:val="18"/>
-              </w:rPr>
-              <w:t>Detection (max)</w:t>
-            </w:r>
-          </w:p>
-        </w:tc>
-        <w:tc>
-          <w:tcPr>
-            <w:tcW w:type="dxa" w:w="3324"/>
-          </w:tcPr>
-          <w:p>
-            <w:r>
-              <w:rPr>
-                <w:b w:val="0"/>
-                <w:sz w:val="18"/>
-              </w:rPr>
-              <w:t>share of targets inside a sensor circle</w:t>
-            </w:r>
-          </w:p>
-        </w:tc>
-        <w:tc>
-          <w:tcPr>
-            <w:tcW w:type="dxa" w:w="3324"/>
-          </w:tcPr>
-          <w:p>
-            <w:r>
-              <w:rPr>
-                <w:b w:val="0"/>
-                <w:sz w:val="18"/>
-              </w:rPr>
-              <w:t>0.25</w:t>
-            </w:r>
-          </w:p>
-        </w:tc>
-      </w:tr>
-      <w:tr>
-        <w:tc>
-          <w:tcPr>
-            <w:tcW w:type="dxa" w:w="3324"/>
-          </w:tcPr>
-          <w:p>
-            <w:r>
-              <w:rPr>
-                <w:b w:val="0"/>
-                <w:sz w:val="18"/>
-              </w:rPr>
-              <w:t>Energy (min)</w:t>
-            </w:r>
-          </w:p>
-        </w:tc>
-        <w:tc>
-          <w:tcPr>
-            <w:tcW w:type="dxa" w:w="3324"/>
-          </w:tcPr>
-          <w:p>
-            <w:r>
-              <w:rPr>
-                <w:b w:val="0"/>
-                <w:sz w:val="18"/>
-              </w:rPr>
-              <w:t>distance x (1 + 0.3·speed) + sensor power x time, divided by the maximum</w:t>
-            </w:r>
-          </w:p>
-        </w:tc>
-        <w:tc>
-          <w:tcPr>
-            <w:tcW w:type="dxa" w:w="3324"/>
-          </w:tcPr>
-          <w:p>
-            <w:r>
-              <w:rPr>
-                <w:b w:val="0"/>
-                <w:sz w:val="18"/>
-              </w:rPr>
-              <w:t>0.15</w:t>
-            </w:r>
-          </w:p>
-        </w:tc>
-      </w:tr>
-      <w:tr>
-        <w:tc>
-          <w:tcPr>
-            <w:tcW w:type="dxa" w:w="3324"/>
-          </w:tcPr>
-          <w:p>
-            <w:r>
-              <w:rPr>
-                <w:b w:val="0"/>
-                <w:sz w:val="18"/>
-              </w:rPr>
-              <w:t>Time (min)</w:t>
-            </w:r>
-          </w:p>
-        </w:tc>
-        <w:tc>
-          <w:tcPr>
-            <w:tcW w:type="dxa" w:w="3324"/>
-          </w:tcPr>
-          <w:p>
-            <w:r>
-              <w:rPr>
-                <w:b w:val="0"/>
-                <w:sz w:val="18"/>
-              </w:rPr>
-              <w:t>flight time of the slowest drone / longest possible time</w:t>
-            </w:r>
-          </w:p>
-        </w:tc>
-        <w:tc>
-          <w:tcPr>
-            <w:tcW w:type="dxa" w:w="3324"/>
-          </w:tcPr>
-          <w:p>
-            <w:r>
-              <w:rPr>
-                <w:b w:val="0"/>
-                <w:sz w:val="18"/>
-              </w:rPr>
-              <w:t>0.1</w:t>
-            </w:r>
-          </w:p>
-        </w:tc>
-      </w:tr>
-      <w:tr>
-        <w:tc>
-          <w:tcPr>
-            <w:tcW w:type="dxa" w:w="3324"/>
-          </w:tcPr>
-          <w:p>
-            <w:r>
-              <w:rPr>
-                <w:b w:val="0"/>
-                <w:sz w:val="18"/>
-              </w:rPr>
-              <w:t>Hazard (min)</w:t>
-            </w:r>
-          </w:p>
-        </w:tc>
-        <w:tc>
-          <w:tcPr>
-            <w:tcW w:type="dxa" w:w="3324"/>
-          </w:tcPr>
-          <w:p>
-            <w:r>
-              <w:rPr>
-                <w:b w:val="0"/>
-                <w:sz w:val="18"/>
-              </w:rPr>
-              <w:t>average hazard value under the flown path</w:t>
-            </w:r>
-          </w:p>
-        </w:tc>
-        <w:tc>
-          <w:tcPr>
-            <w:tcW w:type="dxa" w:w="3324"/>
-          </w:tcPr>
-          <w:p>
-            <w:r>
-              <w:rPr>
-                <w:b w:val="0"/>
-                <w:sz w:val="18"/>
-              </w:rPr>
-              <w:t>0.15</w:t>
-            </w:r>
-          </w:p>
-        </w:tc>
-      </w:tr>
-    </w:tbl>
-    <w:p/>
+    <w:p>
+      <w:pPr>
+        <w:pStyle w:val="ListBullet"/>
+        <w:spacing w:after="20"/>
+      </w:pPr>
+      <w:r>
+        <w:t>Detection (maximise, weight 0.25): share of targets inside a sensor circle.</w:t>
+      </w:r>
+    </w:p>
+    <w:p>
+      <w:pPr>
+        <w:pStyle w:val="ListBullet"/>
+        <w:spacing w:after="20"/>
+      </w:pPr>
+      <w:r>
+        <w:t>Energy (minimise, weight 0.15): distance x (1 + 0.3·speed) + sensor power x time, divided by the maximum.</w:t>
+      </w:r>
+    </w:p>
+    <w:p>
+      <w:pPr>
+        <w:pStyle w:val="ListBullet"/>
+        <w:spacing w:after="20"/>
+      </w:pPr>
+      <w:r>
+        <w:t>Time (minimise, weight 0.10): flight time of the slowest drone / longest possible time.</w:t>
+      </w:r>
+    </w:p>
+    <w:p>
+      <w:pPr>
+        <w:pStyle w:val="ListBullet"/>
+        <w:spacing w:after="20"/>
+      </w:pPr>
+      <w:r>
+        <w:t>Hazard (minimise, weight 0.15): average hazard value under the flown path.</w:t>
+      </w:r>
+    </w:p>
     <w:p>
       <w:pPr>
         <w:jc w:val="both"/>
@@ -709,7 +729,7 @@
         <w:jc w:val="both"/>
       </w:pPr>
       <w:r>
-        <w:t>Constraint handling uses both methods. Repair: if a waypoint falls inside a no-fly zone, it is moved to the nearest open cell. Penalty: if a leg still flies through a no-fly zone, or a drone flies further than the maximum range, the fitness is reduced by 2 x (10 x share of the path inside no-fly zones + extra range). The penalty is large, so plans that break the rules cannot win.</w:t>
+        <w:t>Constraint handling uses both methods. Repair: if a deployment position or waypoint falls inside a no-fly zone, it is moved to the nearest open cell. Penalty: if a leg still flies through a no-fly zone, or a drone flies further than the maximum range, the fitness is reduced by 2 x (10 x share of the path inside no-fly zones + extra range). The penalty is large, so plans that break the rules cannot win.</w:t>
       </w:r>
     </w:p>
     <w:p>
@@ -725,7 +745,7 @@
         <w:jc w:val="both"/>
       </w:pPr>
       <w:r>
-        <w:t>Initial population: 50 random plans. Selection: tournament selection with k = 3 (pick k random plans, the best one becomes a parent); k controls the selection pressure. Crossover (rate 0.9): first a segment swap, where every drone's route is copied from parent 1 or parent 2; then a geometric blend, where one drone's waypoints are a random mix of both parents (a point between them). Mutation (rate 0.1 per waypoint): the waypoint moves by a small Gaussian step (about 3.0 cells), its speed and sensor power change a little, and sometimes two waypoints swap their order. To keep diversity, the 2 best plans survive unchanged (elitism) and 2 new random plans are added every generation. Termination: 100 generations, or no improvement for 30 generations.</w:t>
+        <w:t>Initial population: 50 random plans. Selection: tournament selection with k = 3 (pick k random plans, the best one becomes a parent); k controls the selection pressure. Crossover (rate 0.9): first a segment swap, where every drone's route is copied from parent 1 or parent 2; then a geometric blend, where one drone's positions, speeds and powers are a random mix of both parents (a point between them) and its on/off bits come from either parent. Mutation (rate 0.1): a waypoint moves by a small Gaussian step (about 3.0 cells) and its speed and sensor power change a little, a sensor on/off bit is flipped, a deployment position moves a little, and sometimes two waypoints swap their order. To keep diversity, the 2 best plans survive unchanged (elitism) and 2 new random plans are added every generation. Termination: 100 generations, or no improvement for 30 generations.</w:t>
       </w:r>
     </w:p>
     <w:p>
@@ -741,7 +761,7 @@
         <w:jc w:val="both"/>
       </w:pPr>
       <w:r>
-        <w:t>With seed 42 the run reached 100 generations (4850 fitness evaluations). The best fitness improved from -1.590 in generation 0 to 0.438. The final plan covers 0.89 of the priority-weighted area, finds 100% of the targets, has energy 0.50, time 0.36, hazard 0.09 and penalty 0.00 (no rules broken). The average fitness stays below the best because two random immigrants enter every generation.</w:t>
+        <w:t>With seed 42 the run reached 100 generations (4850 fitness evaluations). The best fitness improved from -2.409 in generation 0 to 0.391. The final plan covers 0.75 of the priority-weighted area, finds 100% of the targets, has energy 0.45, time 0.35, hazard 0.13 and penalty 0.00 (no rules broken). The average fitness stays below the best because two random immigrants (which usually break rules) enter every generation.</w:t>
       </w:r>
     </w:p>
     <w:p>
@@ -751,7 +771,7 @@
       <w:r>
         <w:drawing>
           <wp:inline xmlns:a="http://schemas.openxmlformats.org/drawingml/2006/main" xmlns:pic="http://schemas.openxmlformats.org/drawingml/2006/picture">
-            <wp:extent cx="4320000" cy="2468571"/>
+            <wp:extent cx="3240000" cy="1851429"/>
             <wp:docPr id="1" name="Picture 1"/>
             <wp:cNvGraphicFramePr>
               <a:graphicFrameLocks noChangeAspect="1"/>
@@ -772,7 +792,7 @@
                   <pic:spPr>
                     <a:xfrm>
                       <a:off x="0" y="0"/>
-                      <a:ext cx="4320000" cy="2468571"/>
+                      <a:ext cx="3240000" cy="1851429"/>
                     </a:xfrm>
                     <a:prstGeom prst="rect"/>
                   </pic:spPr>
@@ -802,7 +822,7 @@
       <w:r>
         <w:drawing>
           <wp:inline xmlns:a="http://schemas.openxmlformats.org/drawingml/2006/main" xmlns:pic="http://schemas.openxmlformats.org/drawingml/2006/picture">
-            <wp:extent cx="4860000" cy="4768548"/>
+            <wp:extent cx="3780000" cy="3668151"/>
             <wp:docPr id="2" name="Picture 2"/>
             <wp:cNvGraphicFramePr>
               <a:graphicFrameLocks noChangeAspect="1"/>
@@ -823,7 +843,7 @@
                   <pic:spPr>
                     <a:xfrm>
                       <a:off x="0" y="0"/>
-                      <a:ext cx="4860000" cy="4768548"/>
+                      <a:ext cx="3780000" cy="3668151"/>
                     </a:xfrm>
                     <a:prstGeom prst="rect"/>
                   </pic:spPr>
@@ -843,7 +863,7 @@
           <w:i/>
           <w:sz w:val="18"/>
         </w:rPr>
-        <w:t>Figure 2: Best flight paths in generations 0, 25, 50 and 100 (thicker line = stronger sensor, dotted = way home)</w:t>
+        <w:t>Figure 2: Best flight paths in generations 0, 25, 50 and 100 (triangle = deployment position, solid = sensor on, thicker = stronger, dotted = sensor off)</w:t>
       </w:r>
     </w:p>
     <w:p>
@@ -851,7 +871,7 @@
         <w:jc w:val="both"/>
       </w:pPr>
       <w:r>
-        <w:t>In generation 0 the routes are random zig-zags that cross the no-fly zones (black). Over the generations the routes move around the no-fly zones, each drone takes its own area, and the strong sensor (thick lines) is used inside the priority zones (blue boxes). The coverage heatmaps show the same: the covered area moves to the important zones.</w:t>
+        <w:t>In generation 0 the routes are random zig-zags that cross the no-fly zones (black). Over the generations each drone is deployed close to a disaster zone, the routes go around the no-fly zones, the sensor is switched on (solid lines) inside the priority zones (blue boxes) and off (dotted lines) while travelling between them. The coverage heatmaps show the same: the covered area moves to the important zones.</w:t>
       </w:r>
     </w:p>
     <w:p>
@@ -861,7 +881,7 @@
       <w:r>
         <w:drawing>
           <wp:inline xmlns:a="http://schemas.openxmlformats.org/drawingml/2006/main" xmlns:pic="http://schemas.openxmlformats.org/drawingml/2006/picture">
-            <wp:extent cx="5940000" cy="1896807"/>
+            <wp:extent cx="5400000" cy="1724370"/>
             <wp:docPr id="3" name="Picture 3"/>
             <wp:cNvGraphicFramePr>
               <a:graphicFrameLocks noChangeAspect="1"/>
@@ -882,7 +902,7 @@
                   <pic:spPr>
                     <a:xfrm>
                       <a:off x="0" y="0"/>
-                      <a:ext cx="5940000" cy="1896807"/>
+                      <a:ext cx="5400000" cy="1724370"/>
                     </a:xfrm>
                     <a:prstGeom prst="rect"/>
                   </pic:spPr>
@@ -918,11 +938,12 @@
         <w:jc w:val="both"/>
       </w:pPr>
       <w:r>
-        <w:t>I changed one setting at a time and kept the others at their default values. Each setting was run with 3 seeds for 100 generations. Table 3 shows the final best fitness (mean ± standard deviation).</w:t>
+        <w:t>I changed one setting at a time and kept the others at their default values. Each setting was run with 3 seeds for 100 generations. Table 2 shows the final best fitness (mean ± standard deviation).</w:t>
       </w:r>
     </w:p>
     <w:p>
       <w:pPr>
+        <w:keepNext/>
         <w:jc w:val="center"/>
       </w:pPr>
       <w:r>
@@ -930,7 +951,7 @@
           <w:b/>
           <w:sz w:val="18"/>
         </w:rPr>
-        <w:t>Table 3: Final best fitness for different settings (3 seeds)</w:t>
+        <w:t>Table 2: Final best fitness for different settings (3 seeds)</w:t>
       </w:r>
     </w:p>
     <w:tbl>
@@ -946,11 +967,17 @@
         <w:gridCol w:w="2493"/>
       </w:tblGrid>
       <w:tr>
+        <w:trPr>
+          <w:cantSplit/>
+        </w:trPr>
         <w:tc>
           <w:tcPr>
             <w:tcW w:type="dxa" w:w="2493"/>
           </w:tcPr>
           <w:p>
+            <w:pPr>
+              <w:keepNext/>
+            </w:pPr>
             <w:r>
               <w:rPr>
                 <w:b/>
@@ -965,6 +992,9 @@
             <w:tcW w:type="dxa" w:w="2493"/>
           </w:tcPr>
           <w:p>
+            <w:pPr>
+              <w:keepNext/>
+            </w:pPr>
             <w:r>
               <w:rPr>
                 <w:b/>
@@ -979,6 +1009,9 @@
             <w:tcW w:type="dxa" w:w="2493"/>
           </w:tcPr>
           <w:p>
+            <w:pPr>
+              <w:keepNext/>
+            </w:pPr>
             <w:r>
               <w:rPr>
                 <w:b/>
@@ -993,6 +1026,9 @@
             <w:tcW w:type="dxa" w:w="2493"/>
           </w:tcPr>
           <w:p>
+            <w:pPr>
+              <w:keepNext/>
+            </w:pPr>
             <w:r>
               <w:rPr>
                 <w:b/>
@@ -1004,11 +1040,17 @@
         </w:tc>
       </w:tr>
       <w:tr>
+        <w:trPr>
+          <w:cantSplit/>
+        </w:trPr>
         <w:tc>
           <w:tcPr>
             <w:tcW w:type="dxa" w:w="2493"/>
           </w:tcPr>
           <w:p>
+            <w:pPr>
+              <w:keepNext/>
+            </w:pPr>
             <w:r>
               <w:rPr>
                 <w:b w:val="0"/>
@@ -1023,12 +1065,15 @@
             <w:tcW w:type="dxa" w:w="2493"/>
           </w:tcPr>
           <w:p>
+            <w:pPr>
+              <w:keepNext/>
+            </w:pPr>
             <w:r>
               <w:rPr>
                 <w:b w:val="0"/>
                 <w:sz w:val="18"/>
               </w:rPr>
-              <w:t>20: 0.226 ± 0.145</w:t>
+              <w:t>20: 0.338 ± 0.044</w:t>
             </w:r>
           </w:p>
         </w:tc>
@@ -1037,12 +1082,15 @@
             <w:tcW w:type="dxa" w:w="2493"/>
           </w:tcPr>
           <w:p>
+            <w:pPr>
+              <w:keepNext/>
+            </w:pPr>
             <w:r>
               <w:rPr>
                 <w:b w:val="0"/>
                 <w:sz w:val="18"/>
               </w:rPr>
-              <w:t>50: 0.394 ± 0.054</w:t>
+              <w:t>50: 0.396 ± 0.008</w:t>
             </w:r>
           </w:p>
         </w:tc>
@@ -1051,22 +1099,31 @@
             <w:tcW w:type="dxa" w:w="2493"/>
           </w:tcPr>
           <w:p>
+            <w:pPr>
+              <w:keepNext/>
+            </w:pPr>
             <w:r>
               <w:rPr>
                 <w:b w:val="0"/>
                 <w:sz w:val="18"/>
               </w:rPr>
-              <w:t>100: 0.443 ± 0.006</w:t>
+              <w:t>100: 0.415 ± 0.004</w:t>
             </w:r>
           </w:p>
         </w:tc>
       </w:tr>
       <w:tr>
+        <w:trPr>
+          <w:cantSplit/>
+        </w:trPr>
         <w:tc>
           <w:tcPr>
             <w:tcW w:type="dxa" w:w="2493"/>
           </w:tcPr>
           <w:p>
+            <w:pPr>
+              <w:keepNext/>
+            </w:pPr>
             <w:r>
               <w:rPr>
                 <w:b w:val="0"/>
@@ -1081,12 +1138,15 @@
             <w:tcW w:type="dxa" w:w="2493"/>
           </w:tcPr>
           <w:p>
+            <w:pPr>
+              <w:keepNext/>
+            </w:pPr>
             <w:r>
               <w:rPr>
                 <w:b w:val="0"/>
                 <w:sz w:val="18"/>
               </w:rPr>
-              <w:t>0.02: 0.240 ± 0.028</w:t>
+              <w:t>0.02: 0.393 ± 0.002</w:t>
             </w:r>
           </w:p>
         </w:tc>
@@ -1095,12 +1155,15 @@
             <w:tcW w:type="dxa" w:w="2493"/>
           </w:tcPr>
           <w:p>
+            <w:pPr>
+              <w:keepNext/>
+            </w:pPr>
             <w:r>
               <w:rPr>
                 <w:b w:val="0"/>
                 <w:sz w:val="18"/>
               </w:rPr>
-              <w:t>0.1: 0.394 ± 0.054</w:t>
+              <w:t>0.1: 0.396 ± 0.008</w:t>
             </w:r>
           </w:p>
         </w:tc>
@@ -1109,22 +1172,31 @@
             <w:tcW w:type="dxa" w:w="2493"/>
           </w:tcPr>
           <w:p>
+            <w:pPr>
+              <w:keepNext/>
+            </w:pPr>
             <w:r>
               <w:rPr>
                 <w:b w:val="0"/>
                 <w:sz w:val="18"/>
               </w:rPr>
-              <w:t>0.3: 0.409 ± 0.003</w:t>
+              <w:t>0.3: 0.366 ± 0.012</w:t>
             </w:r>
           </w:p>
         </w:tc>
       </w:tr>
       <w:tr>
+        <w:trPr>
+          <w:cantSplit/>
+        </w:trPr>
         <w:tc>
           <w:tcPr>
             <w:tcW w:type="dxa" w:w="2493"/>
           </w:tcPr>
           <w:p>
+            <w:pPr>
+              <w:keepNext w:val="0"/>
+            </w:pPr>
             <w:r>
               <w:rPr>
                 <w:b w:val="0"/>
@@ -1139,12 +1211,15 @@
             <w:tcW w:type="dxa" w:w="2493"/>
           </w:tcPr>
           <w:p>
+            <w:pPr>
+              <w:keepNext w:val="0"/>
+            </w:pPr>
             <w:r>
               <w:rPr>
                 <w:b w:val="0"/>
                 <w:sz w:val="18"/>
               </w:rPr>
-              <w:t>2: 0.418 ± 0.008</w:t>
+              <w:t>2: 0.366 ± 0.039</w:t>
             </w:r>
           </w:p>
         </w:tc>
@@ -1153,12 +1228,15 @@
             <w:tcW w:type="dxa" w:w="2493"/>
           </w:tcPr>
           <w:p>
+            <w:pPr>
+              <w:keepNext w:val="0"/>
+            </w:pPr>
             <w:r>
               <w:rPr>
                 <w:b w:val="0"/>
                 <w:sz w:val="18"/>
               </w:rPr>
-              <w:t>3: 0.394 ± 0.054</w:t>
+              <w:t>3: 0.396 ± 0.008</w:t>
             </w:r>
           </w:p>
         </w:tc>
@@ -1167,12 +1245,15 @@
             <w:tcW w:type="dxa" w:w="2493"/>
           </w:tcPr>
           <w:p>
+            <w:pPr>
+              <w:keepNext w:val="0"/>
+            </w:pPr>
             <w:r>
               <w:rPr>
                 <w:b w:val="0"/>
                 <w:sz w:val="18"/>
               </w:rPr>
-              <w:t>5: 0.298 ± 0.099</w:t>
+              <w:t>5: 0.407 ± 0.004</w:t>
             </w:r>
           </w:p>
         </w:tc>
@@ -1186,7 +1267,7 @@
       <w:r>
         <w:drawing>
           <wp:inline xmlns:a="http://schemas.openxmlformats.org/drawingml/2006/main" xmlns:pic="http://schemas.openxmlformats.org/drawingml/2006/picture">
-            <wp:extent cx="5940000" cy="1584000"/>
+            <wp:extent cx="5220000" cy="1392000"/>
             <wp:docPr id="4" name="Picture 4"/>
             <wp:cNvGraphicFramePr>
               <a:graphicFrameLocks noChangeAspect="1"/>
@@ -1207,7 +1288,7 @@
                   <pic:spPr>
                     <a:xfrm>
                       <a:off x="0" y="0"/>
-                      <a:ext cx="5940000" cy="1584000"/>
+                      <a:ext cx="5220000" cy="1392000"/>
                     </a:xfrm>
                     <a:prstGeom prst="rect"/>
                   </pic:spPr>
@@ -1235,7 +1316,7 @@
         <w:jc w:val="both"/>
       </w:pPr>
       <w:r>
-        <w:t>Population size: a bigger population gives better and more stable results, because it searches more of the map at the same time (more exploration). The cost is more fitness evaluations: 100 plans need twice the time of 50 plans.</w:t>
+        <w:t>Population size: a bigger population gives better and more stable results, because it searches more of the map at the same time (more exploration). With 20 plans the results were worst and varied most between seeds. The cost is more fitness evaluations: 100 plans need twice the time of 50 plans.</w:t>
       </w:r>
     </w:p>
     <w:p>
@@ -1243,7 +1324,7 @@
         <w:jc w:val="both"/>
       </w:pPr>
       <w:r>
-        <w:t>Mutation rate: 0.02 was clearly the worst. With so little mutation the population becomes similar very quickly and gets stuck (premature convergence). 0.1 and 0.3 both worked well; 0.3 was slightly better and more stable here, because the routes need many changes to move around the no-fly zones.</w:t>
+        <w:t>Mutation rate: 0.02 and 0.1 gave almost the same result, but 0.3 was clearly worse. Too much mutation destroys good routes faster than selection can keep them, so the search becomes almost random (too much exploration). A small mutation rate is enough here because crossover and the random immigrants already keep the population diverse.</w:t>
       </w:r>
     </w:p>
     <w:p>
@@ -1251,7 +1332,7 @@
         <w:jc w:val="both"/>
       </w:pPr>
       <w:r>
-        <w:t>Selection pressure: a small tournament (k = 2) gave the best result, and k = 5 the worst. With a large k the best plans are chosen almost every time, the population loses diversity and some runs get stuck early. This shows the balance between exploration (low pressure) and exploitation (high pressure).</w:t>
+        <w:t>Selection pressure: a small tournament (k = 2) was the worst and the least stable, because weak plans are chosen as parents too often and the GA improves slowly. k = 5 was the best: good plans are chosen more often (more exploitation), and the immigrants and mutation still keep enough diversity to avoid getting stuck. This shows the balance between exploration (low pressure) and exploitation (high pressure).</w:t>
       </w:r>
     </w:p>
     <w:p>
@@ -1272,6 +1353,7 @@
     </w:p>
     <w:p>
       <w:pPr>
+        <w:keepNext/>
         <w:jc w:val="center"/>
       </w:pPr>
       <w:r>
@@ -1279,7 +1361,7 @@
           <w:b/>
           <w:sz w:val="18"/>
         </w:rPr>
-        <w:t>Table 4: GA vs. random search (mean ± standard deviation over 5 seeds)</w:t>
+        <w:t>Table 3: GA vs. random search (mean ± standard deviation over 5 seeds)</w:t>
       </w:r>
     </w:p>
     <w:tbl>
@@ -1294,11 +1376,17 @@
         <w:gridCol w:w="3324"/>
       </w:tblGrid>
       <w:tr>
+        <w:trPr>
+          <w:cantSplit/>
+        </w:trPr>
         <w:tc>
           <w:tcPr>
             <w:tcW w:type="dxa" w:w="3324"/>
           </w:tcPr>
           <w:p>
+            <w:pPr>
+              <w:keepNext/>
+            </w:pPr>
             <w:r>
               <w:rPr>
                 <w:b/>
@@ -1313,6 +1401,9 @@
             <w:tcW w:type="dxa" w:w="3324"/>
           </w:tcPr>
           <w:p>
+            <w:pPr>
+              <w:keepNext/>
+            </w:pPr>
             <w:r>
               <w:rPr>
                 <w:b/>
@@ -1327,6 +1418,9 @@
             <w:tcW w:type="dxa" w:w="3324"/>
           </w:tcPr>
           <w:p>
+            <w:pPr>
+              <w:keepNext/>
+            </w:pPr>
             <w:r>
               <w:rPr>
                 <w:b/>
@@ -1338,11 +1432,17 @@
         </w:tc>
       </w:tr>
       <w:tr>
+        <w:trPr>
+          <w:cantSplit/>
+        </w:trPr>
         <w:tc>
           <w:tcPr>
             <w:tcW w:type="dxa" w:w="3324"/>
           </w:tcPr>
           <w:p>
+            <w:pPr>
+              <w:keepNext/>
+            </w:pPr>
             <w:r>
               <w:rPr>
                 <w:b w:val="0"/>
@@ -1357,12 +1457,15 @@
             <w:tcW w:type="dxa" w:w="3324"/>
           </w:tcPr>
           <w:p>
+            <w:pPr>
+              <w:keepNext/>
+            </w:pPr>
             <w:r>
               <w:rPr>
                 <w:b w:val="0"/>
                 <w:sz w:val="18"/>
               </w:rPr>
-              <w:t>0.415 ± 0.050</w:t>
+              <w:t>0.374 ± 0.039</w:t>
             </w:r>
           </w:p>
         </w:tc>
@@ -1371,22 +1474,31 @@
             <w:tcW w:type="dxa" w:w="3324"/>
           </w:tcPr>
           <w:p>
+            <w:pPr>
+              <w:keepNext/>
+            </w:pPr>
             <w:r>
               <w:rPr>
                 <w:b w:val="0"/>
                 <w:sz w:val="18"/>
               </w:rPr>
-              <w:t>-0.756 ± 0.119</w:t>
+              <w:t>-0.859 ± 0.126</w:t>
             </w:r>
           </w:p>
         </w:tc>
       </w:tr>
       <w:tr>
+        <w:trPr>
+          <w:cantSplit/>
+        </w:trPr>
         <w:tc>
           <w:tcPr>
             <w:tcW w:type="dxa" w:w="3324"/>
           </w:tcPr>
           <w:p>
+            <w:pPr>
+              <w:keepNext/>
+            </w:pPr>
             <w:r>
               <w:rPr>
                 <w:b w:val="0"/>
@@ -1401,12 +1513,15 @@
             <w:tcW w:type="dxa" w:w="3324"/>
           </w:tcPr>
           <w:p>
+            <w:pPr>
+              <w:keepNext/>
+            </w:pPr>
             <w:r>
               <w:rPr>
                 <w:b w:val="0"/>
                 <w:sz w:val="18"/>
               </w:rPr>
-              <w:t>0.888 ± 0.023</w:t>
+              <w:t>0.707 ± 0.063</w:t>
             </w:r>
           </w:p>
         </w:tc>
@@ -1415,22 +1530,31 @@
             <w:tcW w:type="dxa" w:w="3324"/>
           </w:tcPr>
           <w:p>
+            <w:pPr>
+              <w:keepNext/>
+            </w:pPr>
             <w:r>
               <w:rPr>
                 <w:b w:val="0"/>
                 <w:sz w:val="18"/>
               </w:rPr>
-              <w:t>0.665 ± 0.071</w:t>
+              <w:t>0.279 ± 0.140</w:t>
             </w:r>
           </w:p>
         </w:tc>
       </w:tr>
       <w:tr>
+        <w:trPr>
+          <w:cantSplit/>
+        </w:trPr>
         <w:tc>
           <w:tcPr>
             <w:tcW w:type="dxa" w:w="3324"/>
           </w:tcPr>
           <w:p>
+            <w:pPr>
+              <w:keepNext/>
+            </w:pPr>
             <w:r>
               <w:rPr>
                 <w:b w:val="0"/>
@@ -1445,12 +1569,15 @@
             <w:tcW w:type="dxa" w:w="3324"/>
           </w:tcPr>
           <w:p>
+            <w:pPr>
+              <w:keepNext/>
+            </w:pPr>
             <w:r>
               <w:rPr>
                 <w:b w:val="0"/>
                 <w:sz w:val="18"/>
               </w:rPr>
-              <w:t>1.000 ± 0.000</w:t>
+              <w:t>0.947 ± 0.107</w:t>
             </w:r>
           </w:p>
         </w:tc>
@@ -1459,22 +1586,31 @@
             <w:tcW w:type="dxa" w:w="3324"/>
           </w:tcPr>
           <w:p>
+            <w:pPr>
+              <w:keepNext/>
+            </w:pPr>
             <w:r>
               <w:rPr>
                 <w:b w:val="0"/>
                 <w:sz w:val="18"/>
               </w:rPr>
-              <w:t>0.667 ± 0.140</w:t>
+              <w:t>0.320 ± 0.176</w:t>
             </w:r>
           </w:p>
         </w:tc>
       </w:tr>
       <w:tr>
+        <w:trPr>
+          <w:cantSplit/>
+        </w:trPr>
         <w:tc>
           <w:tcPr>
             <w:tcW w:type="dxa" w:w="3324"/>
           </w:tcPr>
           <w:p>
+            <w:pPr>
+              <w:keepNext/>
+            </w:pPr>
             <w:r>
               <w:rPr>
                 <w:b w:val="0"/>
@@ -1489,12 +1625,15 @@
             <w:tcW w:type="dxa" w:w="3324"/>
           </w:tcPr>
           <w:p>
+            <w:pPr>
+              <w:keepNext/>
+            </w:pPr>
             <w:r>
               <w:rPr>
                 <w:b w:val="0"/>
                 <w:sz w:val="18"/>
               </w:rPr>
-              <w:t>0.492 ± 0.041</w:t>
+              <w:t>0.367 ± 0.041</w:t>
             </w:r>
           </w:p>
         </w:tc>
@@ -1503,22 +1642,31 @@
             <w:tcW w:type="dxa" w:w="3324"/>
           </w:tcPr>
           <w:p>
+            <w:pPr>
+              <w:keepNext/>
+            </w:pPr>
             <w:r>
               <w:rPr>
                 <w:b w:val="0"/>
                 <w:sz w:val="18"/>
               </w:rPr>
-              <w:t>0.503 ± 0.032</w:t>
+              <w:t>0.484 ± 0.032</w:t>
             </w:r>
           </w:p>
         </w:tc>
       </w:tr>
       <w:tr>
+        <w:trPr>
+          <w:cantSplit/>
+        </w:trPr>
         <w:tc>
           <w:tcPr>
             <w:tcW w:type="dxa" w:w="3324"/>
           </w:tcPr>
           <w:p>
+            <w:pPr>
+              <w:keepNext/>
+            </w:pPr>
             <w:r>
               <w:rPr>
                 <w:b w:val="0"/>
@@ -1533,12 +1681,15 @@
             <w:tcW w:type="dxa" w:w="3324"/>
           </w:tcPr>
           <w:p>
+            <w:pPr>
+              <w:keepNext/>
+            </w:pPr>
             <w:r>
               <w:rPr>
                 <w:b w:val="0"/>
                 <w:sz w:val="18"/>
               </w:rPr>
-              <w:t>0.401 ± 0.051</w:t>
+              <w:t>0.375 ± 0.052</w:t>
             </w:r>
           </w:p>
         </w:tc>
@@ -1547,22 +1698,31 @@
             <w:tcW w:type="dxa" w:w="3324"/>
           </w:tcPr>
           <w:p>
+            <w:pPr>
+              <w:keepNext/>
+            </w:pPr>
             <w:r>
               <w:rPr>
                 <w:b w:val="0"/>
                 <w:sz w:val="18"/>
               </w:rPr>
-              <w:t>0.509 ± 0.044</w:t>
+              <w:t>0.560 ± 0.112</w:t>
             </w:r>
           </w:p>
         </w:tc>
       </w:tr>
       <w:tr>
+        <w:trPr>
+          <w:cantSplit/>
+        </w:trPr>
         <w:tc>
           <w:tcPr>
             <w:tcW w:type="dxa" w:w="3324"/>
           </w:tcPr>
           <w:p>
+            <w:pPr>
+              <w:keepNext/>
+            </w:pPr>
             <w:r>
               <w:rPr>
                 <w:b w:val="0"/>
@@ -1577,12 +1737,15 @@
             <w:tcW w:type="dxa" w:w="3324"/>
           </w:tcPr>
           <w:p>
+            <w:pPr>
+              <w:keepNext/>
+            </w:pPr>
             <w:r>
               <w:rPr>
                 <w:b w:val="0"/>
                 <w:sz w:val="18"/>
               </w:rPr>
-              <w:t>0.059 ± 0.014</w:t>
+              <w:t>0.115 ± 0.014</w:t>
             </w:r>
           </w:p>
         </w:tc>
@@ -1591,22 +1754,31 @@
             <w:tcW w:type="dxa" w:w="3324"/>
           </w:tcPr>
           <w:p>
+            <w:pPr>
+              <w:keepNext/>
+            </w:pPr>
             <w:r>
               <w:rPr>
                 <w:b w:val="0"/>
                 <w:sz w:val="18"/>
               </w:rPr>
-              <w:t>0.072 ± 0.013</w:t>
+              <w:t>0.081 ± 0.033</w:t>
             </w:r>
           </w:p>
         </w:tc>
       </w:tr>
       <w:tr>
+        <w:trPr>
+          <w:cantSplit/>
+        </w:trPr>
         <w:tc>
           <w:tcPr>
             <w:tcW w:type="dxa" w:w="3324"/>
           </w:tcPr>
           <w:p>
+            <w:pPr>
+              <w:keepNext w:val="0"/>
+            </w:pPr>
             <w:r>
               <w:rPr>
                 <w:b w:val="0"/>
@@ -1621,12 +1793,15 @@
             <w:tcW w:type="dxa" w:w="3324"/>
           </w:tcPr>
           <w:p>
+            <w:pPr>
+              <w:keepNext w:val="0"/>
+            </w:pPr>
             <w:r>
               <w:rPr>
                 <w:b w:val="0"/>
                 <w:sz w:val="18"/>
               </w:rPr>
-              <w:t>0.011 ± 0.023</w:t>
+              <w:t>0.000 ± 0.000</w:t>
             </w:r>
           </w:p>
         </w:tc>
@@ -1635,12 +1810,15 @@
             <w:tcW w:type="dxa" w:w="3324"/>
           </w:tcPr>
           <w:p>
+            <w:pPr>
+              <w:keepNext w:val="0"/>
+            </w:pPr>
             <w:r>
               <w:rPr>
                 <w:b w:val="0"/>
                 <w:sz w:val="18"/>
               </w:rPr>
-              <w:t>0.509 ± 0.045</w:t>
+              <w:t>0.448 ± 0.058</w:t>
             </w:r>
           </w:p>
         </w:tc>
@@ -1654,7 +1832,7 @@
       <w:r>
         <w:drawing>
           <wp:inline xmlns:a="http://schemas.openxmlformats.org/drawingml/2006/main" xmlns:pic="http://schemas.openxmlformats.org/drawingml/2006/picture">
-            <wp:extent cx="4140000" cy="2365714"/>
+            <wp:extent cx="3240000" cy="1851429"/>
             <wp:docPr id="5" name="Picture 5"/>
             <wp:cNvGraphicFramePr>
               <a:graphicFrameLocks noChangeAspect="1"/>
@@ -1675,7 +1853,7 @@
                   <pic:spPr>
                     <a:xfrm>
                       <a:off x="0" y="0"/>
-                      <a:ext cx="4140000" cy="2365714"/>
+                      <a:ext cx="3240000" cy="1851429"/>
                     </a:xfrm>
                     <a:prstGeom prst="rect"/>
                   </pic:spPr>
@@ -1705,7 +1883,7 @@
       <w:r>
         <w:drawing>
           <wp:inline xmlns:a="http://schemas.openxmlformats.org/drawingml/2006/main" xmlns:pic="http://schemas.openxmlformats.org/drawingml/2006/picture">
-            <wp:extent cx="5400000" cy="2491126"/>
+            <wp:extent cx="4500000" cy="2025504"/>
             <wp:docPr id="6" name="Picture 6"/>
             <wp:cNvGraphicFramePr>
               <a:graphicFrameLocks noChangeAspect="1"/>
@@ -1726,7 +1904,7 @@
                   <pic:spPr>
                     <a:xfrm>
                       <a:off x="0" y="0"/>
-                      <a:ext cx="5400000" cy="2491126"/>
+                      <a:ext cx="4500000" cy="2025504"/>
                     </a:xfrm>
                     <a:prstGeom prst="rect"/>
                   </pic:spPr>
@@ -1754,7 +1932,7 @@
         <w:jc w:val="both"/>
       </w:pPr>
       <w:r>
-        <w:t>The GA is much better than random search. Random search never found a plan that avoids all no-fly zones, so it always has a penalty; 4 of the 5 GA runs broke no rule at all. What makes the GA solution special: (1) structured paths: each drone flies to its own area and the routes go around the no-fly zones instead of random zig-zags; (2) sensor scheduling: the strong sensor is used over the priority zones, a weaker one on the way there; (3) priority focus: higher coverage and all targets found; (4) shorter mission time and slightly less hazard. Random search only finds such a plan by luck, while the GA builds it step by step from good parts of earlier plans.</w:t>
+        <w:t>The GA is much better than random search. Random search never found a plan that avoids all no-fly zones, so it always has a penalty; none of the 5 GA runs broke a rule. What makes the GA solution special: (1) structured paths: each drone is deployed near its own disaster zone and the routes go around the no-fly zones instead of random zig-zags; (2) sensor scheduling: the sensor is on over the priority zones and off while travelling, which saves energy; (3) priority focus: much higher coverage and (almost) all targets found; (4) less energy and a shorter mission time. The only cost where the GA is worse is hazard exposure: the most important disaster zone lies inside a hazard zone, and the GA accepts a little risk to survey it, which is exactly the trade-off the weights ask for. Random search only finds such a plan by luck, while the GA builds it step by step from good parts of earlier plans.</w:t>
       </w:r>
     </w:p>
     <w:p>
@@ -1770,7 +1948,7 @@
         <w:jc w:val="both"/>
       </w:pPr>
       <w:r>
-        <w:t>I built a simple GA that plans the routes, speeds and sensor power of a drone fleet. The real-valued chromosome, the weighted fitness function, custom crossover and mutation, and repair plus penalty together give good and legal plans that are far better than random search. Limitations: the map is small and fixed, the energy and sensor models are simple, and the weighted sum gives only one compromise. In the future the GA could use a moving hazard field, more drones, and a multi-objective method such as NSGA-II to show many trade-offs at once.</w:t>
+        <w:t>I built a simple GA that plans the deployment positions, routes, speeds and sensor schedules of a drone fleet. The hybrid chromosome, the weighted fitness function, custom crossover and mutation, and repair plus penalty together give good and legal plans that are far better than random search. Limitations: the map is small and fixed, the energy and sensor models are simple, and the weighted sum gives only one compromise. In the future the GA could use a moving hazard field, more drones, and a multi-objective method such as NSGA-II to show many trade-offs at once.</w:t>
       </w:r>
     </w:p>
     <w:sectPr>
@@ -2151,7 +2329,7 @@
     </w:pPr>
     <w:rPr>
       <w:rFonts w:ascii="Calibri" w:hAnsi="Calibri"/>
-      <w:sz w:val="21"/>
+      <w:sz w:val="20"/>
     </w:rPr>
   </w:style>
   <w:style w:type="paragraph" w:styleId="Header">

</xml_diff>